<commit_message>
Feat: migrate mobile DB operations to secure Next.js proxy API
</commit_message>
<xml_diff>
--- a/public/templates/template-pengaduan.docx
+++ b/public/templates/template-pengaduan.docx
@@ -44,11 +44,11 @@
                     <pic:cNvPicPr/>
                   </pic:nvPicPr>
                   <pic:blipFill>
-                    <a:blip r:embed="rId6" cstate="print">
+                    <a:blip r:embed="rId7" cstate="print">
                       <a:extLst>
                         <a:ext uri="{BEBA8EAE-BF5A-486C-A8C5-ECC9F3942E4B}">
                           <a14:imgProps xmlns:a14="http://schemas.microsoft.com/office/drawing/2010/main">
-                            <a14:imgLayer r:embed="rId7">
+                            <a14:imgLayer r:embed="rId8">
                               <a14:imgEffect>
                                 <a14:sharpenSoften amount="50000"/>
                               </a14:imgEffect>
@@ -987,83 +987,47 @@
           <w:sz w:val="24"/>
           <w:szCs w:val="24"/>
         </w:rPr>
-        <w:t xml:space="preserve">terkait </w:t>
-      </w:r>
-      <w:r>
-        <w:rPr>
-          <w:rFonts w:ascii="Arial" w:hAnsi="Arial" w:cs="Arial"/>
-          <w:sz w:val="24"/>
-          <w:szCs w:val="24"/>
-        </w:rPr>
-        <w:t>{</w:t>
-      </w:r>
-      <w:proofErr w:type="spellStart"/>
-      <w:r>
-        <w:rPr>
-          <w:rFonts w:ascii="Arial" w:hAnsi="Arial" w:cs="Arial"/>
-          <w:sz w:val="24"/>
-          <w:szCs w:val="24"/>
-        </w:rPr>
-        <w:t>deskripsi_aduan</w:t>
-      </w:r>
-      <w:proofErr w:type="spellEnd"/>
-      <w:r>
-        <w:rPr>
-          <w:rFonts w:ascii="Arial" w:hAnsi="Arial" w:cs="Arial"/>
-          <w:sz w:val="24"/>
-          <w:szCs w:val="24"/>
-        </w:rPr>
-        <w:t>} </w:t>
-      </w:r>
-      <w:r>
-        <w:rPr>
-          <w:rFonts w:ascii="Arial" w:hAnsi="Arial" w:cs="Arial"/>
-          <w:sz w:val="24"/>
-          <w:szCs w:val="24"/>
-        </w:rPr>
         <w:t xml:space="preserve">sebagai berikut </w:t>
       </w:r>
     </w:p>
     <w:p>
       <w:pPr>
+        <w:pStyle w:val="ListParagraph"/>
+        <w:numPr>
+          <w:ilvl w:val="0"/>
+          <w:numId w:val="1"/>
+        </w:numPr>
         <w:spacing w:after="0" w:line="360" w:lineRule="auto"/>
+        <w:ind w:left="567" w:hanging="567"/>
         <w:jc w:val="both"/>
         <w:rPr>
           <w:rFonts w:ascii="Arial" w:hAnsi="Arial" w:cs="Arial"/>
-          <w:sz w:val="24"/>
-          <w:szCs w:val="24"/>
-        </w:rPr>
-      </w:pPr>
-      <w:r>
-        <w:rPr>
-          <w:rFonts w:ascii="Arial" w:hAnsi="Arial" w:cs="Arial"/>
-          <w:sz w:val="24"/>
-          <w:szCs w:val="24"/>
-        </w:rPr>
-        <w:t>{</w:t>
-      </w:r>
-      <w:proofErr w:type="spellStart"/>
-      <w:r>
-        <w:rPr>
-          <w:rFonts w:ascii="Arial" w:hAnsi="Arial" w:cs="Arial"/>
-          <w:sz w:val="24"/>
-          <w:szCs w:val="24"/>
-        </w:rPr>
-        <w:t>catatan_verlap</w:t>
-      </w:r>
-      <w:proofErr w:type="spellEnd"/>
-      <w:r>
-        <w:rPr>
-          <w:rFonts w:ascii="Arial" w:hAnsi="Arial" w:cs="Arial"/>
-          <w:sz w:val="24"/>
-          <w:szCs w:val="24"/>
-        </w:rPr>
-        <w:t>}</w:t>
+          <w:b/>
+          <w:bCs/>
+          <w:sz w:val="24"/>
+          <w:szCs w:val="24"/>
+        </w:rPr>
+      </w:pPr>
+      <w:r>
+        <w:rPr>
+          <w:rFonts w:ascii="Arial" w:hAnsi="Arial" w:cs="Arial"/>
+          <w:b/>
+          <w:bCs/>
+          <w:sz w:val="24"/>
+          <w:szCs w:val="24"/>
+        </w:rPr>
+        <w:t>Informasi Pengaduan</w:t>
       </w:r>
     </w:p>
     <w:p>
       <w:pPr>
+        <w:pStyle w:val="ListParagraph"/>
+        <w:numPr>
+          <w:ilvl w:val="0"/>
+          <w:numId w:val="2"/>
+        </w:numPr>
         <w:spacing w:after="0" w:line="360" w:lineRule="auto"/>
+        <w:ind w:left="993"/>
         <w:jc w:val="both"/>
         <w:rPr>
           <w:rFonts w:ascii="Arial" w:hAnsi="Arial" w:cs="Arial"/>
@@ -1071,10 +1035,20 @@
           <w:szCs w:val="24"/>
         </w:rPr>
       </w:pPr>
+      <w:r>
+        <w:rPr>
+          <w:rFonts w:ascii="Arial" w:hAnsi="Arial" w:cs="Arial"/>
+          <w:sz w:val="24"/>
+          <w:szCs w:val="24"/>
+        </w:rPr>
+        <w:t xml:space="preserve">Hal yang diadukan: </w:t>
+      </w:r>
     </w:p>
     <w:p>
       <w:pPr>
+        <w:pStyle w:val="ListParagraph"/>
         <w:spacing w:after="0" w:line="360" w:lineRule="auto"/>
+        <w:ind w:left="993"/>
         <w:jc w:val="both"/>
         <w:rPr>
           <w:rFonts w:ascii="Arial" w:hAnsi="Arial" w:cs="Arial"/>
@@ -1088,12 +1062,36 @@
           <w:sz w:val="24"/>
           <w:szCs w:val="24"/>
         </w:rPr>
-        <w:t>Hasil Tindak Lanjut Verifikasi Lapangan Sebagai Berikut :</w:t>
+        <w:t>{</w:t>
+      </w:r>
+      <w:proofErr w:type="spellStart"/>
+      <w:r>
+        <w:rPr>
+          <w:rFonts w:ascii="Arial" w:hAnsi="Arial" w:cs="Arial"/>
+          <w:sz w:val="24"/>
+          <w:szCs w:val="24"/>
+        </w:rPr>
+        <w:t>kegiatan_aduan</w:t>
+      </w:r>
+      <w:proofErr w:type="spellEnd"/>
+      <w:r>
+        <w:rPr>
+          <w:rFonts w:ascii="Arial" w:hAnsi="Arial" w:cs="Arial"/>
+          <w:sz w:val="24"/>
+          <w:szCs w:val="24"/>
+        </w:rPr>
+        <w:t>}</w:t>
       </w:r>
     </w:p>
     <w:p>
       <w:pPr>
+        <w:pStyle w:val="ListParagraph"/>
+        <w:numPr>
+          <w:ilvl w:val="0"/>
+          <w:numId w:val="2"/>
+        </w:numPr>
         <w:spacing w:after="0" w:line="360" w:lineRule="auto"/>
+        <w:ind w:left="993"/>
         <w:jc w:val="both"/>
         <w:rPr>
           <w:rFonts w:ascii="Arial" w:hAnsi="Arial" w:cs="Arial"/>
@@ -1107,30 +1105,14 @@
           <w:sz w:val="24"/>
           <w:szCs w:val="24"/>
         </w:rPr>
-        <w:t>{</w:t>
-      </w:r>
-      <w:proofErr w:type="spellStart"/>
-      <w:r>
-        <w:rPr>
-          <w:rFonts w:ascii="Arial" w:hAnsi="Arial" w:cs="Arial"/>
-          <w:sz w:val="24"/>
-          <w:szCs w:val="24"/>
-        </w:rPr>
-        <w:t>hasil_verlap</w:t>
-      </w:r>
-      <w:proofErr w:type="spellEnd"/>
-      <w:r>
-        <w:rPr>
-          <w:rFonts w:ascii="Arial" w:hAnsi="Arial" w:cs="Arial"/>
-          <w:sz w:val="24"/>
-          <w:szCs w:val="24"/>
-        </w:rPr>
-        <w:t>}</w:t>
+        <w:t xml:space="preserve">Nama Terlapor: </w:t>
       </w:r>
     </w:p>
     <w:p>
       <w:pPr>
+        <w:pStyle w:val="ListParagraph"/>
         <w:spacing w:after="0" w:line="360" w:lineRule="auto"/>
+        <w:ind w:left="993"/>
         <w:jc w:val="both"/>
         <w:rPr>
           <w:rFonts w:ascii="Arial" w:hAnsi="Arial" w:cs="Arial"/>
@@ -1138,6 +1120,296 @@
           <w:szCs w:val="24"/>
         </w:rPr>
       </w:pPr>
+      <w:r>
+        <w:rPr>
+          <w:rFonts w:ascii="Arial" w:hAnsi="Arial" w:cs="Arial"/>
+          <w:sz w:val="24"/>
+          <w:szCs w:val="24"/>
+        </w:rPr>
+        <w:t>{</w:t>
+      </w:r>
+      <w:proofErr w:type="spellStart"/>
+      <w:r>
+        <w:rPr>
+          <w:rFonts w:ascii="Arial" w:hAnsi="Arial" w:cs="Arial"/>
+          <w:sz w:val="24"/>
+          <w:szCs w:val="24"/>
+        </w:rPr>
+        <w:t>nama_terlapor</w:t>
+      </w:r>
+      <w:proofErr w:type="spellEnd"/>
+      <w:r>
+        <w:rPr>
+          <w:rFonts w:ascii="Arial" w:hAnsi="Arial" w:cs="Arial"/>
+          <w:sz w:val="24"/>
+          <w:szCs w:val="24"/>
+        </w:rPr>
+        <w:t>}</w:t>
+      </w:r>
+    </w:p>
+    <w:p>
+      <w:pPr>
+        <w:pStyle w:val="ListParagraph"/>
+        <w:numPr>
+          <w:ilvl w:val="0"/>
+          <w:numId w:val="2"/>
+        </w:numPr>
+        <w:spacing w:after="0" w:line="360" w:lineRule="auto"/>
+        <w:ind w:left="993"/>
+        <w:jc w:val="both"/>
+        <w:rPr>
+          <w:rFonts w:ascii="Arial" w:hAnsi="Arial" w:cs="Arial"/>
+          <w:sz w:val="24"/>
+          <w:szCs w:val="24"/>
+        </w:rPr>
+      </w:pPr>
+      <w:r>
+        <w:rPr>
+          <w:rFonts w:ascii="Arial" w:hAnsi="Arial" w:cs="Arial"/>
+          <w:sz w:val="24"/>
+          <w:szCs w:val="24"/>
+        </w:rPr>
+        <w:t xml:space="preserve">Lokasi: </w:t>
+      </w:r>
+    </w:p>
+    <w:p>
+      <w:pPr>
+        <w:pStyle w:val="ListParagraph"/>
+        <w:spacing w:after="0" w:line="360" w:lineRule="auto"/>
+        <w:ind w:left="993"/>
+        <w:jc w:val="both"/>
+        <w:rPr>
+          <w:rFonts w:ascii="Arial" w:hAnsi="Arial" w:cs="Arial"/>
+          <w:sz w:val="24"/>
+          <w:szCs w:val="24"/>
+        </w:rPr>
+      </w:pPr>
+      <w:r>
+        <w:rPr>
+          <w:rFonts w:ascii="Arial" w:hAnsi="Arial" w:cs="Arial"/>
+          <w:sz w:val="24"/>
+          <w:szCs w:val="24"/>
+        </w:rPr>
+        <w:t>{</w:t>
+      </w:r>
+      <w:proofErr w:type="spellStart"/>
+      <w:r>
+        <w:rPr>
+          <w:rFonts w:ascii="Arial" w:hAnsi="Arial" w:cs="Arial"/>
+          <w:sz w:val="24"/>
+          <w:szCs w:val="24"/>
+        </w:rPr>
+        <w:t>lokasi_aduan</w:t>
+      </w:r>
+      <w:proofErr w:type="spellEnd"/>
+      <w:r>
+        <w:rPr>
+          <w:rFonts w:ascii="Arial" w:hAnsi="Arial" w:cs="Arial"/>
+          <w:sz w:val="24"/>
+          <w:szCs w:val="24"/>
+        </w:rPr>
+        <w:t>}</w:t>
+      </w:r>
+    </w:p>
+    <w:p>
+      <w:pPr>
+        <w:pStyle w:val="ListParagraph"/>
+        <w:numPr>
+          <w:ilvl w:val="0"/>
+          <w:numId w:val="2"/>
+        </w:numPr>
+        <w:spacing w:after="0" w:line="360" w:lineRule="auto"/>
+        <w:ind w:left="993"/>
+        <w:jc w:val="both"/>
+        <w:rPr>
+          <w:rFonts w:ascii="Arial" w:hAnsi="Arial" w:cs="Arial"/>
+          <w:sz w:val="24"/>
+          <w:szCs w:val="24"/>
+        </w:rPr>
+      </w:pPr>
+      <w:r>
+        <w:rPr>
+          <w:rFonts w:ascii="Arial" w:hAnsi="Arial" w:cs="Arial"/>
+          <w:sz w:val="24"/>
+          <w:szCs w:val="24"/>
+        </w:rPr>
+        <w:t xml:space="preserve">Deskripsi/Perihal: </w:t>
+      </w:r>
+    </w:p>
+    <w:p>
+      <w:pPr>
+        <w:pStyle w:val="ListParagraph"/>
+        <w:spacing w:after="0" w:line="360" w:lineRule="auto"/>
+        <w:ind w:left="993"/>
+        <w:jc w:val="both"/>
+        <w:rPr>
+          <w:rFonts w:ascii="Arial" w:hAnsi="Arial" w:cs="Arial"/>
+          <w:sz w:val="24"/>
+          <w:szCs w:val="24"/>
+        </w:rPr>
+      </w:pPr>
+      <w:r>
+        <w:rPr>
+          <w:rFonts w:ascii="Arial" w:hAnsi="Arial" w:cs="Arial"/>
+          <w:sz w:val="24"/>
+          <w:szCs w:val="24"/>
+        </w:rPr>
+        <w:t>{</w:t>
+      </w:r>
+      <w:proofErr w:type="spellStart"/>
+      <w:r>
+        <w:rPr>
+          <w:rFonts w:ascii="Arial" w:hAnsi="Arial" w:cs="Arial"/>
+          <w:sz w:val="24"/>
+          <w:szCs w:val="24"/>
+        </w:rPr>
+        <w:t>deskripsi_aduan</w:t>
+      </w:r>
+      <w:proofErr w:type="spellEnd"/>
+      <w:r>
+        <w:rPr>
+          <w:rFonts w:ascii="Arial" w:hAnsi="Arial" w:cs="Arial"/>
+          <w:sz w:val="24"/>
+          <w:szCs w:val="24"/>
+        </w:rPr>
+        <w:t>}</w:t>
+      </w:r>
+    </w:p>
+    <w:p>
+      <w:pPr>
+        <w:pStyle w:val="ListParagraph"/>
+        <w:numPr>
+          <w:ilvl w:val="0"/>
+          <w:numId w:val="1"/>
+        </w:numPr>
+        <w:spacing w:after="0" w:line="360" w:lineRule="auto"/>
+        <w:ind w:left="567" w:hanging="567"/>
+        <w:jc w:val="both"/>
+        <w:rPr>
+          <w:rFonts w:ascii="Arial" w:hAnsi="Arial" w:cs="Arial"/>
+          <w:b/>
+          <w:bCs/>
+          <w:sz w:val="24"/>
+          <w:szCs w:val="24"/>
+        </w:rPr>
+      </w:pPr>
+      <w:r>
+        <w:rPr>
+          <w:rFonts w:ascii="Arial" w:hAnsi="Arial" w:cs="Arial"/>
+          <w:b/>
+          <w:bCs/>
+          <w:sz w:val="24"/>
+          <w:szCs w:val="24"/>
+        </w:rPr>
+        <w:t>Kronologi Aduan</w:t>
+      </w:r>
+    </w:p>
+    <w:p>
+      <w:pPr>
+        <w:pStyle w:val="ListParagraph"/>
+        <w:spacing w:after="0" w:line="360" w:lineRule="auto"/>
+        <w:ind w:left="567"/>
+        <w:jc w:val="both"/>
+        <w:rPr>
+          <w:rFonts w:ascii="Arial" w:hAnsi="Arial" w:cs="Arial"/>
+          <w:sz w:val="24"/>
+          <w:szCs w:val="24"/>
+        </w:rPr>
+      </w:pPr>
+      <w:r>
+        <w:rPr>
+          <w:rFonts w:ascii="Arial" w:hAnsi="Arial" w:cs="Arial"/>
+          <w:sz w:val="24"/>
+          <w:szCs w:val="24"/>
+        </w:rPr>
+        <w:t>{</w:t>
+      </w:r>
+      <w:proofErr w:type="spellStart"/>
+      <w:r>
+        <w:rPr>
+          <w:rFonts w:ascii="Arial" w:hAnsi="Arial" w:cs="Arial"/>
+          <w:sz w:val="24"/>
+          <w:szCs w:val="24"/>
+        </w:rPr>
+        <w:t>catatan_verlap</w:t>
+      </w:r>
+      <w:proofErr w:type="spellEnd"/>
+      <w:r>
+        <w:rPr>
+          <w:rFonts w:ascii="Arial" w:hAnsi="Arial" w:cs="Arial"/>
+          <w:sz w:val="24"/>
+          <w:szCs w:val="24"/>
+        </w:rPr>
+        <w:t>}</w:t>
+      </w:r>
+    </w:p>
+    <w:p>
+      <w:pPr>
+        <w:pStyle w:val="ListParagraph"/>
+        <w:numPr>
+          <w:ilvl w:val="0"/>
+          <w:numId w:val="1"/>
+        </w:numPr>
+        <w:spacing w:after="0" w:line="360" w:lineRule="auto"/>
+        <w:ind w:left="567" w:hanging="567"/>
+        <w:jc w:val="both"/>
+        <w:rPr>
+          <w:rFonts w:ascii="Arial" w:hAnsi="Arial" w:cs="Arial"/>
+          <w:b/>
+          <w:bCs/>
+          <w:sz w:val="24"/>
+          <w:szCs w:val="24"/>
+        </w:rPr>
+      </w:pPr>
+      <w:r>
+        <w:rPr>
+          <w:rFonts w:ascii="Arial" w:hAnsi="Arial" w:cs="Arial"/>
+          <w:b/>
+          <w:bCs/>
+          <w:sz w:val="24"/>
+          <w:szCs w:val="24"/>
+        </w:rPr>
+        <w:t>Hasil Tindak Lanjut</w:t>
+      </w:r>
+    </w:p>
+    <w:p>
+      <w:pPr>
+        <w:pStyle w:val="ListParagraph"/>
+        <w:spacing w:after="0" w:line="360" w:lineRule="auto"/>
+        <w:ind w:left="567"/>
+        <w:jc w:val="both"/>
+        <w:rPr>
+          <w:rFonts w:ascii="Arial" w:hAnsi="Arial" w:cs="Arial"/>
+          <w:sz w:val="24"/>
+          <w:szCs w:val="24"/>
+        </w:rPr>
+      </w:pPr>
+      <w:r>
+        <w:rPr>
+          <w:rFonts w:ascii="Arial" w:hAnsi="Arial" w:cs="Arial"/>
+          <w:sz w:val="24"/>
+          <w:szCs w:val="24"/>
+        </w:rPr>
+        <w:t>{</w:t>
+      </w:r>
+      <w:proofErr w:type="spellStart"/>
+      <w:r>
+        <w:rPr>
+          <w:rFonts w:ascii="Arial" w:hAnsi="Arial" w:cs="Arial"/>
+          <w:sz w:val="24"/>
+          <w:szCs w:val="24"/>
+        </w:rPr>
+        <w:t>hasil_verlap</w:t>
+      </w:r>
+      <w:proofErr w:type="spellEnd"/>
+      <w:r>
+        <w:rPr>
+          <w:rFonts w:ascii="Arial" w:hAnsi="Arial" w:cs="Arial"/>
+          <w:sz w:val="24"/>
+          <w:szCs w:val="24"/>
+        </w:rPr>
+        <w:t>}</w:t>
+      </w:r>
     </w:p>
     <w:tbl>
       <w:tblPr>
@@ -1309,7 +1581,6 @@
     <w:p>
       <w:pPr>
         <w:spacing w:after="0" w:line="360" w:lineRule="auto"/>
-        <w:jc w:val="both"/>
         <w:rPr>
           <w:rFonts w:ascii="Arial" w:hAnsi="Arial" w:cs="Arial"/>
           <w:sz w:val="24"/>
@@ -1322,13 +1593,17 @@
         <w:spacing w:line="278" w:lineRule="auto"/>
         <w:rPr>
           <w:rFonts w:ascii="Arial" w:hAnsi="Arial" w:cs="Arial"/>
-          <w:sz w:val="24"/>
-          <w:szCs w:val="24"/>
-        </w:rPr>
-      </w:pPr>
-      <w:r>
-        <w:rPr>
-          <w:rFonts w:ascii="Arial" w:hAnsi="Arial" w:cs="Arial"/>
+          <w:b/>
+          <w:bCs/>
+          <w:sz w:val="24"/>
+          <w:szCs w:val="24"/>
+        </w:rPr>
+      </w:pPr>
+      <w:r>
+        <w:rPr>
+          <w:rFonts w:ascii="Arial" w:hAnsi="Arial" w:cs="Arial"/>
+          <w:b/>
+          <w:bCs/>
           <w:sz w:val="24"/>
           <w:szCs w:val="24"/>
         </w:rPr>
@@ -1341,17 +1616,6 @@
         <w:jc w:val="center"/>
         <w:rPr>
           <w:rFonts w:ascii="Arial" w:hAnsi="Arial" w:cs="Arial"/>
-          <w:sz w:val="24"/>
-          <w:szCs w:val="24"/>
-        </w:rPr>
-      </w:pPr>
-    </w:p>
-    <w:p>
-      <w:pPr>
-        <w:spacing w:after="0" w:line="360" w:lineRule="auto"/>
-        <w:jc w:val="center"/>
-        <w:rPr>
-          <w:rFonts w:ascii="Arial" w:hAnsi="Arial" w:cs="Arial"/>
           <w:b/>
           <w:bCs/>
           <w:sz w:val="24"/>
@@ -1366,6 +1630,7 @@
           <w:sz w:val="24"/>
           <w:szCs w:val="24"/>
         </w:rPr>
+        <w:lastRenderedPageBreak/>
         <w:t>LAMPIRAN</w:t>
       </w:r>
       <w:r>
@@ -1575,6 +1840,219 @@
     </w:p>
   </w:footnote>
 </w:footnotes>
+</file>
+
+<file path=word/numbering.xml><?xml version="1.0" encoding="utf-8"?>
+<w:numbering xmlns:wpc="http://schemas.microsoft.com/office/word/2010/wordprocessingCanvas" xmlns:cx="http://schemas.microsoft.com/office/drawing/2014/chartex" xmlns:cx1="http://schemas.microsoft.com/office/drawing/2015/9/8/chartex" xmlns:cx2="http://schemas.microsoft.com/office/drawing/2015/10/21/chartex" xmlns:cx3="http://schemas.microsoft.com/office/drawing/2016/5/9/chartex" xmlns:cx4="http://schemas.microsoft.com/office/drawing/2016/5/10/chartex" xmlns:cx5="http://schemas.microsoft.com/office/drawing/2016/5/11/chartex" xmlns:cx6="http://schemas.microsoft.com/office/drawing/2016/5/12/chartex" xmlns:cx7="http://schemas.microsoft.com/office/drawing/2016/5/13/chartex" xmlns:cx8="http://schemas.microsoft.com/office/drawing/2016/5/14/chartex" xmlns:mc="http://schemas.openxmlformats.org/markup-compatibility/2006" xmlns:aink="http://schemas.microsoft.com/office/drawing/2016/ink" xmlns:am3d="http://schemas.microsoft.com/office/drawing/2017/model3d" xmlns:o="urn:schemas-microsoft-com:office:office" xmlns:oel="http://schemas.microsoft.com/office/2019/extlst" xmlns:r="http://schemas.openxmlformats.org/officeDocument/2006/relationships" xmlns:m="http://schemas.openxmlformats.org/officeDocument/2006/math" xmlns:v="urn:schemas-microsoft-com:vml" xmlns:wp14="http://schemas.microsoft.com/office/word/2010/wordprocessingDrawing" xmlns:wp="http://schemas.openxmlformats.org/drawingml/2006/wordprocessingDrawing" xmlns:w10="urn:schemas-microsoft-com:office:word" xmlns:w="http://schemas.openxmlformats.org/wordprocessingml/2006/main" xmlns:w14="http://schemas.microsoft.com/office/word/2010/wordml" xmlns:w15="http://schemas.microsoft.com/office/word/2012/wordml" xmlns:w16cex="http://schemas.microsoft.com/office/word/2018/wordml/cex" xmlns:w16cid="http://schemas.microsoft.com/office/word/2016/wordml/cid" xmlns:w16="http://schemas.microsoft.com/office/word/2018/wordml" xmlns:w16sdtdh="http://schemas.microsoft.com/office/word/2020/wordml/sdtdatahash" xmlns:w16se="http://schemas.microsoft.com/office/word/2015/wordml/symex" xmlns:wpg="http://schemas.microsoft.com/office/word/2010/wordprocessingGroup" xmlns:wpi="http://schemas.microsoft.com/office/word/2010/wordprocessingInk" xmlns:wne="http://schemas.microsoft.com/office/word/2006/wordml" xmlns:wps="http://schemas.microsoft.com/office/word/2010/wordprocessingShape" mc:Ignorable="w14 w15 w16se w16cid w16 w16cex w16sdtdh wp14">
+  <w:abstractNum w:abstractNumId="0" w15:restartNumberingAfterBreak="0">
+    <w:nsid w:val="12335558"/>
+    <w:multiLevelType w:val="hybridMultilevel"/>
+    <w:tmpl w:val="7ED64A7C"/>
+    <w:lvl w:ilvl="0" w:tplc="04210015">
+      <w:start w:val="1"/>
+      <w:numFmt w:val="upperLetter"/>
+      <w:lvlText w:val="%1."/>
+      <w:lvlJc w:val="left"/>
+      <w:pPr>
+        <w:ind w:left="720" w:hanging="360"/>
+      </w:pPr>
+      <w:rPr>
+        <w:rFonts w:hint="default"/>
+      </w:rPr>
+    </w:lvl>
+    <w:lvl w:ilvl="1" w:tplc="04210019" w:tentative="1">
+      <w:start w:val="1"/>
+      <w:numFmt w:val="lowerLetter"/>
+      <w:lvlText w:val="%2."/>
+      <w:lvlJc w:val="left"/>
+      <w:pPr>
+        <w:ind w:left="1440" w:hanging="360"/>
+      </w:pPr>
+    </w:lvl>
+    <w:lvl w:ilvl="2" w:tplc="0421001B" w:tentative="1">
+      <w:start w:val="1"/>
+      <w:numFmt w:val="lowerRoman"/>
+      <w:lvlText w:val="%3."/>
+      <w:lvlJc w:val="right"/>
+      <w:pPr>
+        <w:ind w:left="2160" w:hanging="180"/>
+      </w:pPr>
+    </w:lvl>
+    <w:lvl w:ilvl="3" w:tplc="0421000F" w:tentative="1">
+      <w:start w:val="1"/>
+      <w:numFmt w:val="decimal"/>
+      <w:lvlText w:val="%4."/>
+      <w:lvlJc w:val="left"/>
+      <w:pPr>
+        <w:ind w:left="2880" w:hanging="360"/>
+      </w:pPr>
+    </w:lvl>
+    <w:lvl w:ilvl="4" w:tplc="04210019" w:tentative="1">
+      <w:start w:val="1"/>
+      <w:numFmt w:val="lowerLetter"/>
+      <w:lvlText w:val="%5."/>
+      <w:lvlJc w:val="left"/>
+      <w:pPr>
+        <w:ind w:left="3600" w:hanging="360"/>
+      </w:pPr>
+    </w:lvl>
+    <w:lvl w:ilvl="5" w:tplc="0421001B" w:tentative="1">
+      <w:start w:val="1"/>
+      <w:numFmt w:val="lowerRoman"/>
+      <w:lvlText w:val="%6."/>
+      <w:lvlJc w:val="right"/>
+      <w:pPr>
+        <w:ind w:left="4320" w:hanging="180"/>
+      </w:pPr>
+    </w:lvl>
+    <w:lvl w:ilvl="6" w:tplc="0421000F" w:tentative="1">
+      <w:start w:val="1"/>
+      <w:numFmt w:val="decimal"/>
+      <w:lvlText w:val="%7."/>
+      <w:lvlJc w:val="left"/>
+      <w:pPr>
+        <w:ind w:left="5040" w:hanging="360"/>
+      </w:pPr>
+    </w:lvl>
+    <w:lvl w:ilvl="7" w:tplc="04210019" w:tentative="1">
+      <w:start w:val="1"/>
+      <w:numFmt w:val="lowerLetter"/>
+      <w:lvlText w:val="%8."/>
+      <w:lvlJc w:val="left"/>
+      <w:pPr>
+        <w:ind w:left="5760" w:hanging="360"/>
+      </w:pPr>
+    </w:lvl>
+    <w:lvl w:ilvl="8" w:tplc="0421001B" w:tentative="1">
+      <w:start w:val="1"/>
+      <w:numFmt w:val="lowerRoman"/>
+      <w:lvlText w:val="%9."/>
+      <w:lvlJc w:val="right"/>
+      <w:pPr>
+        <w:ind w:left="6480" w:hanging="180"/>
+      </w:pPr>
+    </w:lvl>
+  </w:abstractNum>
+  <w:abstractNum w:abstractNumId="1" w15:restartNumberingAfterBreak="0">
+    <w:nsid w:val="36B16505"/>
+    <w:multiLevelType w:val="hybridMultilevel"/>
+    <w:tmpl w:val="87EE5A1E"/>
+    <w:lvl w:ilvl="0" w:tplc="04210001">
+      <w:start w:val="1"/>
+      <w:numFmt w:val="bullet"/>
+      <w:lvlText w:val=""/>
+      <w:lvlJc w:val="left"/>
+      <w:pPr>
+        <w:ind w:left="1287" w:hanging="360"/>
+      </w:pPr>
+      <w:rPr>
+        <w:rFonts w:ascii="Symbol" w:hAnsi="Symbol" w:hint="default"/>
+      </w:rPr>
+    </w:lvl>
+    <w:lvl w:ilvl="1" w:tplc="04210003" w:tentative="1">
+      <w:start w:val="1"/>
+      <w:numFmt w:val="bullet"/>
+      <w:lvlText w:val="o"/>
+      <w:lvlJc w:val="left"/>
+      <w:pPr>
+        <w:ind w:left="2007" w:hanging="360"/>
+      </w:pPr>
+      <w:rPr>
+        <w:rFonts w:ascii="Courier New" w:hAnsi="Courier New" w:cs="Courier New" w:hint="default"/>
+      </w:rPr>
+    </w:lvl>
+    <w:lvl w:ilvl="2" w:tplc="04210005" w:tentative="1">
+      <w:start w:val="1"/>
+      <w:numFmt w:val="bullet"/>
+      <w:lvlText w:val=""/>
+      <w:lvlJc w:val="left"/>
+      <w:pPr>
+        <w:ind w:left="2727" w:hanging="360"/>
+      </w:pPr>
+      <w:rPr>
+        <w:rFonts w:ascii="Wingdings" w:hAnsi="Wingdings" w:hint="default"/>
+      </w:rPr>
+    </w:lvl>
+    <w:lvl w:ilvl="3" w:tplc="04210001" w:tentative="1">
+      <w:start w:val="1"/>
+      <w:numFmt w:val="bullet"/>
+      <w:lvlText w:val=""/>
+      <w:lvlJc w:val="left"/>
+      <w:pPr>
+        <w:ind w:left="3447" w:hanging="360"/>
+      </w:pPr>
+      <w:rPr>
+        <w:rFonts w:ascii="Symbol" w:hAnsi="Symbol" w:hint="default"/>
+      </w:rPr>
+    </w:lvl>
+    <w:lvl w:ilvl="4" w:tplc="04210003" w:tentative="1">
+      <w:start w:val="1"/>
+      <w:numFmt w:val="bullet"/>
+      <w:lvlText w:val="o"/>
+      <w:lvlJc w:val="left"/>
+      <w:pPr>
+        <w:ind w:left="4167" w:hanging="360"/>
+      </w:pPr>
+      <w:rPr>
+        <w:rFonts w:ascii="Courier New" w:hAnsi="Courier New" w:cs="Courier New" w:hint="default"/>
+      </w:rPr>
+    </w:lvl>
+    <w:lvl w:ilvl="5" w:tplc="04210005" w:tentative="1">
+      <w:start w:val="1"/>
+      <w:numFmt w:val="bullet"/>
+      <w:lvlText w:val=""/>
+      <w:lvlJc w:val="left"/>
+      <w:pPr>
+        <w:ind w:left="4887" w:hanging="360"/>
+      </w:pPr>
+      <w:rPr>
+        <w:rFonts w:ascii="Wingdings" w:hAnsi="Wingdings" w:hint="default"/>
+      </w:rPr>
+    </w:lvl>
+    <w:lvl w:ilvl="6" w:tplc="04210001" w:tentative="1">
+      <w:start w:val="1"/>
+      <w:numFmt w:val="bullet"/>
+      <w:lvlText w:val=""/>
+      <w:lvlJc w:val="left"/>
+      <w:pPr>
+        <w:ind w:left="5607" w:hanging="360"/>
+      </w:pPr>
+      <w:rPr>
+        <w:rFonts w:ascii="Symbol" w:hAnsi="Symbol" w:hint="default"/>
+      </w:rPr>
+    </w:lvl>
+    <w:lvl w:ilvl="7" w:tplc="04210003" w:tentative="1">
+      <w:start w:val="1"/>
+      <w:numFmt w:val="bullet"/>
+      <w:lvlText w:val="o"/>
+      <w:lvlJc w:val="left"/>
+      <w:pPr>
+        <w:ind w:left="6327" w:hanging="360"/>
+      </w:pPr>
+      <w:rPr>
+        <w:rFonts w:ascii="Courier New" w:hAnsi="Courier New" w:cs="Courier New" w:hint="default"/>
+      </w:rPr>
+    </w:lvl>
+    <w:lvl w:ilvl="8" w:tplc="04210005" w:tentative="1">
+      <w:start w:val="1"/>
+      <w:numFmt w:val="bullet"/>
+      <w:lvlText w:val=""/>
+      <w:lvlJc w:val="left"/>
+      <w:pPr>
+        <w:ind w:left="7047" w:hanging="360"/>
+      </w:pPr>
+      <w:rPr>
+        <w:rFonts w:ascii="Wingdings" w:hAnsi="Wingdings" w:hint="default"/>
+      </w:rPr>
+    </w:lvl>
+  </w:abstractNum>
+  <w:num w:numId="1" w16cid:durableId="431555578">
+    <w:abstractNumId w:val="0"/>
+  </w:num>
+  <w:num w:numId="2" w16cid:durableId="2010135637">
+    <w:abstractNumId w:val="1"/>
+  </w:num>
+</w:numbering>
 </file>
 
 <file path=word/styles.xml><?xml version="1.0" encoding="utf-8"?>

</xml_diff>